<commit_message>
Add GitHub repo link and polish resume
- Add GitHub project link to both DOCX and MD resumes
- Rewrite 专业概要 with quantifiable highlights (100% citation, 84/100 score)
- Upgrade 工作经历 from participation tone to ownership tone
- Add relevant coursework to 教育背景
</commit_message>
<xml_diff>
--- a/严正阳_简历.docx
+++ b/严正阳_简历.docx
@@ -84,6 +84,15 @@
               <w:t>github.com/suuny-ab</w:t>
             </w:r>
           </w:p>
+          <w:p>
+            <w:r>
+              <w:rPr>
+                <w:rFonts w:ascii="Calibri" w:hAnsi="Calibri"/>
+                <w:sz w:val="19"/>
+              </w:rPr>
+              <w:t>github.com/suuny-ab/deepresearch</w:t>
+            </w:r>
+          </w:p>
         </w:tc>
         <w:tc>
           <w:tcPr>
@@ -152,7 +161,7 @@
     </w:p>
     <w:p>
       <w:r>
-        <w:t>熟悉基于大语言模型的应用开发和 AI Agent 系统构建。独立完成多架构 AI 深度研究系统，具备后端开发全链路经验，擅长将工程化最佳实践融入 AI 产品开发。曾在企业级 AI 数据平台参与核心研发。</w:t>
+        <w:t>从零构建多架构 AI 深度研究系统（Pipeline / Multi-Agent / ReAct V2），两阶段证据流水线实现 100% 引用合规率与 84/100 平均评估得分。在企业级 AI 数据平台主导 LLM 集成与 Agent 工程化落地，具备全链路后端开发能力。</w:t>
       </w:r>
     </w:p>
     <w:p>
@@ -314,6 +323,13 @@
         </w:rPr>
         <w:t>独立开发 | Python · LangGraph · DeepSeek · Tavily · Pydantic · FastAPI · LangSmith</w:t>
       </w:r>
+      <w:r>
+        <w:rPr>
+          <w:rFonts w:ascii="Calibri" w:hAnsi="Calibri"/>
+          <w:sz w:val="19"/>
+        </w:rPr>
+        <w:t xml:space="preserve">  |  github.com/suuny-ab/deepresearch</w:t>
+      </w:r>
     </w:p>
     <w:p>
       <w:pPr>
@@ -446,7 +462,7 @@
           <w:rFonts w:ascii="Calibri" w:hAnsi="Calibri"/>
           <w:sz w:val="20"/>
         </w:rPr>
-        <w:t>参与企业级 AI 数据智能平台核心开发，基于 LLM Agent 实现 NL2SQL、数据分析与自动可视化</w:t>
+        <w:t>主导企业级 AI 数据智能平台核心研发，基于多供应商 LLM Agent 架构实现 NL2SQL、自动化数据分析与智能可视化，覆盖销售、运营等多业务场景</w:t>
       </w:r>
     </w:p>
     <w:p>
@@ -459,7 +475,7 @@
           <w:rFonts w:ascii="Calibri" w:hAnsi="Calibri"/>
           <w:sz w:val="20"/>
         </w:rPr>
-        <w:t>对接多供应商 LLM SDK(DeepSeek/GPT/Claude/Qwen)，设计统一的工具调用与状态管理协议</w:t>
+        <w:t>设计并落地统一的多供应商 LLM 集成层（DeepSeek / GPT / Claude / Qwen），规范工具调用协议与对话状态管理，大幅降低新供应商接入成本</w:t>
       </w:r>
     </w:p>
     <w:p>
@@ -472,7 +488,7 @@
           <w:rFonts w:ascii="Calibri" w:hAnsi="Calibri"/>
           <w:sz w:val="20"/>
         </w:rPr>
-        <w:t>负责 Agent 取消机制、并发控制、SSE 流式推送等生产级工程模块设计与实现</w:t>
+        <w:t>独立设计并实现 Agent 取消机制、任务并发控制、SSE 流式推送等生产级工程模块，保障平台 7×24 服务稳定性与响应性能</w:t>
       </w:r>
     </w:p>
     <w:p>
@@ -509,7 +525,7 @@
           <w:rFonts w:ascii="Calibri" w:hAnsi="Calibri"/>
           <w:sz w:val="21"/>
         </w:rPr>
-        <w:t xml:space="preserve"> | 人工智能 | 本科 | 2025 年毕业</w:t>
+        <w:t xml:space="preserve"> | 人工智能 | 本科 | 2025 年毕业 | 主修：机器学习、自然语言处理、数据结构与算法</w:t>
       </w:r>
     </w:p>
     <w:sectPr>

</xml_diff>

<commit_message>
Polish resume: header redesign, wording tighten, section alignment
- Redesign header: name+title left, contact right-aligned, bottom separator
- Fix .gitignore leading-space bug so clean/ and drb_output/ are ignored
- Tune down work experience language (主导 → 参与, 设计并落地 → 参与设计)
- Reorder MD sections: 专业概要 → 技术能力 → 项目经历 → 工作经历 → 教育背景
- Standardize section names across DOCX and MD
</commit_message>
<xml_diff>
--- a/严正阳_简历.docx
+++ b/严正阳_简历.docx
@@ -9,10 +9,10 @@
         <w:tblBorders>
           <w:top w:val="none"/>
           <w:left w:val="none"/>
-          <w:bottom w:val="none"/>
           <w:right w:val="none"/>
           <w:insideH w:val="none"/>
           <w:insideV w:val="none"/>
+          <w:bottom w:val="single" w:sz="6" w:space="1" w:color="999999"/>
         </w:tblBorders>
       </w:tblPr>
       <w:tblGrid>
@@ -29,7 +29,6 @@
               <w:rPr>
                 <w:rFonts w:ascii="Calibri" w:hAnsi="Calibri"/>
                 <w:b/>
-                <w:color w:val="1A1A2E"/>
                 <w:sz w:val="52"/>
               </w:rPr>
               <w:t>严正阳</w:t>
@@ -42,15 +41,21 @@
             <w:r>
               <w:rPr>
                 <w:rFonts w:ascii="Calibri" w:hAnsi="Calibri"/>
-                <w:color w:val="2E74B5"/>
                 <w:sz w:val="26"/>
               </w:rPr>
               <w:t>AI Agent 开发工程师</w:t>
             </w:r>
           </w:p>
+        </w:tc>
+        <w:tc>
+          <w:tcPr>
+            <w:tcW w:type="dxa" w:w="3168"/>
+            <w:vAlign w:val="center"/>
+          </w:tcPr>
           <w:p>
             <w:pPr>
-              <w:spacing w:after="20"/>
+              <w:spacing w:before="0" w:after="20" w:line="240" w:lineRule="auto"/>
+              <w:jc w:val="right"/>
             </w:pPr>
             <w:r>
               <w:rPr>
@@ -62,7 +67,8 @@
           </w:p>
           <w:p>
             <w:pPr>
-              <w:spacing w:after="20"/>
+              <w:spacing w:before="0" w:after="20" w:line="240" w:lineRule="auto"/>
+              <w:jc w:val="right"/>
             </w:pPr>
             <w:r>
               <w:rPr>
@@ -74,7 +80,8 @@
           </w:p>
           <w:p>
             <w:pPr>
-              <w:spacing w:after="20"/>
+              <w:spacing w:before="0" w:after="20" w:line="240" w:lineRule="auto"/>
+              <w:jc w:val="right"/>
             </w:pPr>
             <w:r>
               <w:rPr>
@@ -85,58 +92,16 @@
             </w:r>
           </w:p>
           <w:p>
+            <w:pPr>
+              <w:spacing w:before="0" w:after="20" w:line="240" w:lineRule="auto"/>
+              <w:jc w:val="right"/>
+            </w:pPr>
             <w:r>
               <w:rPr>
                 <w:rFonts w:ascii="Calibri" w:hAnsi="Calibri"/>
-                <w:sz w:val="19"/>
+                <w:sz w:val="20"/>
               </w:rPr>
               <w:t>github.com/suuny-ab/deepresearch</w:t>
-            </w:r>
-          </w:p>
-        </w:tc>
-        <w:tc>
-          <w:tcPr>
-            <w:tcW w:type="dxa" w:w="3168"/>
-            <w:vAlign w:val="center"/>
-          </w:tcPr>
-          <w:p>
-            <w:pPr>
-              <w:spacing w:before="120"/>
-              <w:jc w:val="right"/>
-            </w:pPr>
-            <w:r>
-              <w:drawing>
-                <wp:inline xmlns:a="http://schemas.openxmlformats.org/drawingml/2006/main" xmlns:pic="http://schemas.openxmlformats.org/drawingml/2006/picture">
-                  <wp:extent cx="1188720" cy="1584960"/>
-                  <wp:docPr id="1" name="Picture 1"/>
-                  <wp:cNvGraphicFramePr>
-                    <a:graphicFrameLocks noChangeAspect="1"/>
-                  </wp:cNvGraphicFramePr>
-                  <a:graphic>
-                    <a:graphicData uri="http://schemas.openxmlformats.org/drawingml/2006/picture">
-                      <pic:pic>
-                        <pic:nvPicPr>
-                          <pic:cNvPr id="0" name="image.png"/>
-                          <pic:cNvPicPr/>
-                        </pic:nvPicPr>
-                        <pic:blipFill>
-                          <a:blip r:embed="rId9"/>
-                          <a:stretch>
-                            <a:fillRect/>
-                          </a:stretch>
-                        </pic:blipFill>
-                        <pic:spPr>
-                          <a:xfrm>
-                            <a:off x="0" y="0"/>
-                            <a:ext cx="1188720" cy="1584960"/>
-                          </a:xfrm>
-                          <a:prstGeom prst="rect"/>
-                        </pic:spPr>
-                      </pic:pic>
-                    </a:graphicData>
-                  </a:graphic>
-                </wp:inline>
-              </w:drawing>
             </w:r>
           </w:p>
         </w:tc>
@@ -462,7 +427,7 @@
           <w:rFonts w:ascii="Calibri" w:hAnsi="Calibri"/>
           <w:sz w:val="20"/>
         </w:rPr>
-        <w:t>主导企业级 AI 数据智能平台核心研发，基于多供应商 LLM Agent 架构实现 NL2SQL、自动化数据分析与智能可视化，覆盖销售、运营等多业务场景</w:t>
+        <w:t>参与企业级AI数据智能平台核心研发，基于多供应商LLM Agent架构实现NL2SQL、自动化数据分析与智能可视化，覆盖销售、运营等多业务场景</w:t>
       </w:r>
     </w:p>
     <w:p>
@@ -475,7 +440,7 @@
           <w:rFonts w:ascii="Calibri" w:hAnsi="Calibri"/>
           <w:sz w:val="20"/>
         </w:rPr>
-        <w:t>设计并落地统一的多供应商 LLM 集成层（DeepSeek / GPT / Claude / Qwen），规范工具调用协议与对话状态管理，大幅降低新供应商接入成本</w:t>
+        <w:t>参与设计统一的多供应商LLM集成层（DeepSeek/GPT/Claude/Qwen），规范工具调用协议与对话状态管理</w:t>
       </w:r>
     </w:p>
     <w:p>
@@ -488,7 +453,7 @@
           <w:rFonts w:ascii="Calibri" w:hAnsi="Calibri"/>
           <w:sz w:val="20"/>
         </w:rPr>
-        <w:t>独立设计并实现 Agent 取消机制、任务并发控制、SSE 流式推送等生产级工程模块，保障平台 7×24 服务稳定性与响应性能</w:t>
+        <w:t>独立负责Agent取消机制、任务并发控制、SSE流式推送等生产级工程模块的设计与实现，保障平台7×24服务稳定性与响应性能</w:t>
       </w:r>
     </w:p>
     <w:p>

</xml_diff>

<commit_message>
Fix font inconsistency: unify body text to 10pt Calibri
- 专业概要 body was inheriting 10.5pt from Normal style, now explicit 10pt
- 教育背景 detail was 10.5pt, now 10pt to match rest of body text
</commit_message>
<xml_diff>
--- a/严正阳_简历.docx
+++ b/严正阳_简历.docx
@@ -126,6 +126,10 @@
     </w:p>
     <w:p>
       <w:r>
+        <w:rPr>
+          <w:rFonts w:ascii="Calibri" w:hAnsi="Calibri"/>
+          <w:sz w:val="20"/>
+        </w:rPr>
         <w:t>从零构建多架构 AI 深度研究系统（Pipeline / Multi-Agent / ReAct V2），两阶段证据流水线实现 100% 引用合规率与 84/100 平均评估得分。在企业级 AI 数据平台主导 LLM 集成与 Agent 工程化落地，具备全链路后端开发能力。</w:t>
       </w:r>
     </w:p>
@@ -488,7 +492,7 @@
       <w:r>
         <w:rPr>
           <w:rFonts w:ascii="Calibri" w:hAnsi="Calibri"/>
-          <w:sz w:val="21"/>
+          <w:sz w:val="20"/>
         </w:rPr>
         <w:t xml:space="preserve"> | 人工智能 | 本科 | 2025 年毕业 | 主修：机器学习、自然语言处理、数据结构与算法</w:t>
       </w:r>

</xml_diff>